<commit_message>
4 release was done
</commit_message>
<xml_diff>
--- a/docs/SIMS_Sprint_Delivery_Plan_v1.1.docx
+++ b/docs/SIMS_Sprint_Delivery_Plan_v1.1.docx
@@ -15480,6 +15480,24 @@
               </w:rPr>
               <w:t xml:space="preserve"> creation. On every release (biometric or manual override), send a push/SMS notification to all guardians linked to the student (or specifically the primary contact, per school config) including the releasing guardian's name and the release timestamp. Write a test asserting notification dispatch on both verification method types.</w:t>
             </w:r>
+            <w:r>
+              <w:rPr>
+                <w:rFonts w:ascii="Courier New" w:eastAsia="Courier New" w:hAnsi="Courier New" w:cs="Courier New"/>
+                <w:color w:val="3A2A52"/>
+                <w:sz w:val="18"/>
+                <w:szCs w:val="18"/>
+              </w:rPr>
+              <w:br/>
+            </w:r>
+            <w:r>
+              <w:rPr>
+                <w:rFonts w:ascii="Courier New" w:eastAsia="Courier New" w:hAnsi="Courier New" w:cs="Courier New"/>
+                <w:color w:val="FF0000"/>
+                <w:sz w:val="18"/>
+                <w:szCs w:val="18"/>
+              </w:rPr>
+              <w:t>done</w:t>
+            </w:r>
           </w:p>
         </w:tc>
       </w:tr>
@@ -15834,6 +15852,24 @@
                 <w:szCs w:val="18"/>
               </w:rPr>
               <w:t>.</w:t>
+            </w:r>
+            <w:r>
+              <w:rPr>
+                <w:rFonts w:ascii="Courier New" w:eastAsia="Courier New" w:hAnsi="Courier New" w:cs="Courier New"/>
+                <w:color w:val="3A2A52"/>
+                <w:sz w:val="18"/>
+                <w:szCs w:val="18"/>
+              </w:rPr>
+              <w:br/>
+            </w:r>
+            <w:r>
+              <w:rPr>
+                <w:rFonts w:ascii="Courier New" w:eastAsia="Courier New" w:hAnsi="Courier New" w:cs="Courier New"/>
+                <w:color w:val="FF0000"/>
+                <w:sz w:val="18"/>
+                <w:szCs w:val="18"/>
+              </w:rPr>
+              <w:t>done</w:t>
             </w:r>
           </w:p>
         </w:tc>
@@ -16259,6 +16295,24 @@
               </w:rPr>
               <w:t xml:space="preserve"> units as a starting point for the new year, allowing edits before save. Write a test for the copy action producing a new set of units linked to the new year without mutating the original.</w:t>
             </w:r>
+            <w:r>
+              <w:rPr>
+                <w:rFonts w:ascii="Courier New" w:eastAsia="Courier New" w:hAnsi="Courier New" w:cs="Courier New"/>
+                <w:color w:val="3A2A52"/>
+                <w:sz w:val="18"/>
+                <w:szCs w:val="18"/>
+              </w:rPr>
+              <w:br/>
+            </w:r>
+            <w:r>
+              <w:rPr>
+                <w:rFonts w:ascii="Courier New" w:eastAsia="Courier New" w:hAnsi="Courier New" w:cs="Courier New"/>
+                <w:color w:val="FF0000"/>
+                <w:sz w:val="18"/>
+                <w:szCs w:val="18"/>
+              </w:rPr>
+              <w:t>done</w:t>
+            </w:r>
           </w:p>
         </w:tc>
       </w:tr>
@@ -16654,6 +16708,24 @@
               </w:rPr>
               <w:t xml:space="preserve"> for the subject has a planned date before allowing final submission. Build a scheduled reminder notification a configurable number of days before a school-wide planning deadline. Write a test for the finalized-timetable gate and the all-units-required validation.</w:t>
             </w:r>
+            <w:r>
+              <w:rPr>
+                <w:rFonts w:ascii="Courier New" w:eastAsia="Courier New" w:hAnsi="Courier New" w:cs="Courier New"/>
+                <w:color w:val="3A2A52"/>
+                <w:sz w:val="18"/>
+                <w:szCs w:val="18"/>
+              </w:rPr>
+              <w:br/>
+            </w:r>
+            <w:r>
+              <w:rPr>
+                <w:rFonts w:ascii="Courier New" w:eastAsia="Courier New" w:hAnsi="Courier New" w:cs="Courier New"/>
+                <w:color w:val="FF0000"/>
+                <w:sz w:val="18"/>
+                <w:szCs w:val="18"/>
+              </w:rPr>
+              <w:t>done</w:t>
+            </w:r>
           </w:p>
         </w:tc>
       </w:tr>
@@ -16830,6 +16902,7 @@
                 <w:sz w:val="19"/>
                 <w:szCs w:val="19"/>
               </w:rPr>
+              <w:lastRenderedPageBreak/>
               <w:t>Acceptance criteria:</w:t>
             </w:r>
           </w:p>
@@ -16880,7 +16953,6 @@
                 <w:sz w:val="19"/>
                 <w:szCs w:val="19"/>
               </w:rPr>
-              <w:lastRenderedPageBreak/>
               <w:t>System flags when actual completion falls behind the planned date</w:t>
             </w:r>
           </w:p>
@@ -16916,7 +16988,6 @@
                 <w:sz w:val="19"/>
                 <w:szCs w:val="19"/>
               </w:rPr>
-              <w:lastRenderedPageBreak/>
               <w:t>AI coding prompt (paste into Claude Code):</w:t>
             </w:r>
           </w:p>
@@ -17049,6 +17120,24 @@
                 <w:szCs w:val="18"/>
               </w:rPr>
               <w:t xml:space="preserve"> is still false. Surface this flag in the teacher's lesson list UI. Write a test for the behind-schedule flag computation across past/future planned dates.</w:t>
+            </w:r>
+            <w:r>
+              <w:rPr>
+                <w:rFonts w:ascii="Courier New" w:eastAsia="Courier New" w:hAnsi="Courier New" w:cs="Courier New"/>
+                <w:color w:val="3A2A52"/>
+                <w:sz w:val="18"/>
+                <w:szCs w:val="18"/>
+              </w:rPr>
+              <w:br/>
+            </w:r>
+            <w:r>
+              <w:rPr>
+                <w:rFonts w:ascii="Courier New" w:eastAsia="Courier New" w:hAnsi="Courier New" w:cs="Courier New"/>
+                <w:color w:val="FF0000"/>
+                <w:sz w:val="18"/>
+                <w:szCs w:val="18"/>
+              </w:rPr>
+              <w:t>done</w:t>
             </w:r>
           </w:p>
         </w:tc>
@@ -17368,6 +17457,33 @@
               </w:rPr>
               <w:t>=true units. Write a test for the aggregation query grouping correctness.</w:t>
             </w:r>
+            <w:r>
+              <w:rPr>
+                <w:rFonts w:ascii="Courier New" w:eastAsia="Courier New" w:hAnsi="Courier New" w:cs="Courier New"/>
+                <w:color w:val="3A2A52"/>
+                <w:sz w:val="18"/>
+                <w:szCs w:val="18"/>
+              </w:rPr>
+              <w:br/>
+            </w:r>
+            <w:r>
+              <w:rPr>
+                <w:rFonts w:ascii="Courier New" w:eastAsia="Courier New" w:hAnsi="Courier New" w:cs="Courier New"/>
+                <w:color w:val="FF0000"/>
+                <w:sz w:val="18"/>
+                <w:szCs w:val="18"/>
+              </w:rPr>
+              <w:t>done</w:t>
+            </w:r>
+            <w:r>
+              <w:rPr>
+                <w:rFonts w:ascii="Courier New" w:eastAsia="Courier New" w:hAnsi="Courier New" w:cs="Courier New"/>
+                <w:color w:val="3A2A52"/>
+                <w:sz w:val="18"/>
+                <w:szCs w:val="18"/>
+              </w:rPr>
+              <w:t xml:space="preserve"> </w:t>
+            </w:r>
           </w:p>
         </w:tc>
       </w:tr>
@@ -17821,6 +17937,24 @@
                 <w:szCs w:val="18"/>
               </w:rPr>
               <w:t xml:space="preserve"> past end of day, feeding into the free-period alert system (ACAD-091). Write a test for the missing-entry detection query.</w:t>
+            </w:r>
+            <w:r>
+              <w:rPr>
+                <w:rFonts w:ascii="Courier New" w:eastAsia="Courier New" w:hAnsi="Courier New" w:cs="Courier New"/>
+                <w:color w:val="3A2A52"/>
+                <w:sz w:val="18"/>
+                <w:szCs w:val="18"/>
+              </w:rPr>
+              <w:br/>
+            </w:r>
+            <w:r>
+              <w:rPr>
+                <w:rFonts w:ascii="Courier New" w:eastAsia="Courier New" w:hAnsi="Courier New" w:cs="Courier New"/>
+                <w:color w:val="FF0000"/>
+                <w:sz w:val="18"/>
+                <w:szCs w:val="18"/>
+              </w:rPr>
+              <w:t>done</w:t>
             </w:r>
           </w:p>
         </w:tc>
@@ -18195,6 +18329,24 @@
               </w:rPr>
               <w:t>=true in the response). Write a test for the carry-forward filter logic across month boundaries.</w:t>
             </w:r>
+            <w:r>
+              <w:rPr>
+                <w:rFonts w:ascii="Courier New" w:eastAsia="Courier New" w:hAnsi="Courier New" w:cs="Courier New"/>
+                <w:color w:val="3A2A52"/>
+                <w:sz w:val="18"/>
+                <w:szCs w:val="18"/>
+              </w:rPr>
+              <w:br/>
+            </w:r>
+            <w:r>
+              <w:rPr>
+                <w:rFonts w:ascii="Courier New" w:eastAsia="Courier New" w:hAnsi="Courier New" w:cs="Courier New"/>
+                <w:color w:val="FF0000"/>
+                <w:sz w:val="18"/>
+                <w:szCs w:val="18"/>
+              </w:rPr>
+              <w:t>done</w:t>
+            </w:r>
           </w:p>
         </w:tc>
       </w:tr>
@@ -18550,6 +18702,21 @@
               </w:rPr>
               <w:t xml:space="preserve"> slots (from ACAD-084) — as a simple list with links to each, no auto-action taken. Write a test for the free-period detection logic and the combined task aggregation query.</w:t>
             </w:r>
+            <w:r>
+              <w:rPr>
+                <w:rFonts w:ascii="Courier New" w:eastAsia="Courier New" w:hAnsi="Courier New" w:cs="Courier New"/>
+                <w:color w:val="3A2A52"/>
+                <w:sz w:val="18"/>
+                <w:szCs w:val="18"/>
+              </w:rPr>
+              <w:br/>
+            </w:r>
+            <w:r>
+              <w:rPr>
+                <w:color w:val="FF0000"/>
+              </w:rPr>
+              <w:t>done</w:t>
+            </w:r>
           </w:p>
         </w:tc>
       </w:tr>
@@ -18806,6 +18973,7 @@
                 <w:sz w:val="18"/>
                 <w:szCs w:val="18"/>
               </w:rPr>
+              <w:lastRenderedPageBreak/>
               <w:t xml:space="preserve">Build a weekly batch job computing a rolling average of Mark scores per student per subject over the last N assessments, flagging a </w:t>
             </w:r>
             <w:proofErr w:type="spellStart"/>
@@ -18826,17 +18994,22 @@
                 <w:sz w:val="18"/>
                 <w:szCs w:val="18"/>
               </w:rPr>
-              <w:t xml:space="preserve">=true if the rolling average has dropped over consecutive periods beyond a configurable threshold. Build </w:t>
-            </w:r>
-            <w:r>
-              <w:rPr>
-                <w:rFonts w:ascii="Courier New" w:eastAsia="Courier New" w:hAnsi="Courier New" w:cs="Courier New"/>
-                <w:color w:val="3A2A52"/>
-                <w:sz w:val="18"/>
-                <w:szCs w:val="18"/>
-              </w:rPr>
-              <w:lastRenderedPageBreak/>
-              <w:t>a simple line chart UI (e.g. recharts) showing the score-over-time series per student per subject, not a single score. Write a test for the trend-detection threshold logic.</w:t>
+              <w:t>=true if the rolling average has dropped over consecutive periods beyond a configurable threshold. Build a simple line chart UI (e.g. recharts) showing the score-over-time series per student per subject, not a single score. Write a test for the trend-detection threshold logic.</w:t>
+            </w:r>
+            <w:r>
+              <w:rPr>
+                <w:rFonts w:ascii="Courier New" w:eastAsia="Courier New" w:hAnsi="Courier New" w:cs="Courier New"/>
+                <w:color w:val="3A2A52"/>
+                <w:sz w:val="18"/>
+                <w:szCs w:val="18"/>
+              </w:rPr>
+              <w:br/>
+            </w:r>
+            <w:r>
+              <w:rPr>
+                <w:color w:val="FF0000"/>
+              </w:rPr>
+              <w:t>done</w:t>
             </w:r>
           </w:p>
         </w:tc>
@@ -19176,6 +19349,24 @@
               </w:rPr>
               <w:t>', description: plain text describing the pattern only — no diagnostic or clinical language permitted in the description field). Write a test confirming the flag only fires when both conditions are true, and a content test asserting the description template contains no disorder-name strings.</w:t>
             </w:r>
+            <w:r>
+              <w:rPr>
+                <w:rFonts w:ascii="Courier New" w:eastAsia="Courier New" w:hAnsi="Courier New" w:cs="Courier New"/>
+                <w:color w:val="3A2A52"/>
+                <w:sz w:val="18"/>
+                <w:szCs w:val="18"/>
+              </w:rPr>
+              <w:br/>
+            </w:r>
+            <w:r>
+              <w:rPr>
+                <w:rFonts w:ascii="Courier New" w:eastAsia="Courier New" w:hAnsi="Courier New" w:cs="Courier New"/>
+                <w:color w:val="FF0000"/>
+                <w:sz w:val="18"/>
+                <w:szCs w:val="18"/>
+              </w:rPr>
+              <w:t>done</w:t>
+            </w:r>
           </w:p>
         </w:tc>
       </w:tr>
@@ -19511,6 +19702,24 @@
               </w:rPr>
               <w:t>-role recipient for this flag type.</w:t>
             </w:r>
+            <w:r>
+              <w:rPr>
+                <w:rFonts w:ascii="Courier New" w:eastAsia="Courier New" w:hAnsi="Courier New" w:cs="Courier New"/>
+                <w:color w:val="3A2A52"/>
+                <w:sz w:val="18"/>
+                <w:szCs w:val="18"/>
+              </w:rPr>
+              <w:br/>
+            </w:r>
+            <w:r>
+              <w:rPr>
+                <w:rFonts w:ascii="Courier New" w:eastAsia="Courier New" w:hAnsi="Courier New" w:cs="Courier New"/>
+                <w:color w:val="FF0000"/>
+                <w:sz w:val="18"/>
+                <w:szCs w:val="18"/>
+              </w:rPr>
+              <w:t>done</w:t>
+            </w:r>
           </w:p>
         </w:tc>
       </w:tr>
@@ -19644,6 +19853,7 @@
                 <w:sz w:val="20"/>
                 <w:szCs w:val="20"/>
               </w:rPr>
+              <w:lastRenderedPageBreak/>
               <w:t>I want to view my own combined performance dashboard</w:t>
             </w:r>
           </w:p>
@@ -19687,6 +19897,7 @@
                 <w:sz w:val="19"/>
                 <w:szCs w:val="19"/>
               </w:rPr>
+              <w:lastRenderedPageBreak/>
               <w:t>Acceptance criteria:</w:t>
             </w:r>
           </w:p>
@@ -19704,7 +19915,6 @@
                 <w:sz w:val="19"/>
                 <w:szCs w:val="19"/>
               </w:rPr>
-              <w:lastRenderedPageBreak/>
               <w:t>Dashboard combines my attendance/punctuality, class pass rates, and syllabus completion into one view</w:t>
             </w:r>
           </w:p>
@@ -19774,7 +19984,6 @@
                 <w:sz w:val="19"/>
                 <w:szCs w:val="19"/>
               </w:rPr>
-              <w:lastRenderedPageBreak/>
               <w:t>AI coding prompt (paste into Claude Code):</w:t>
             </w:r>
           </w:p>
@@ -19827,6 +20036,24 @@
                 <w:szCs w:val="18"/>
               </w:rPr>
               <w:t>. Present as separate charts/figures on one dashboard page — explicitly do not compute or display a single combined score. Restrict access so a teacher can only view their own dashboard via this route. Write a test confirming the access restriction (a teacher cannot fetch another teacher's performance data via this endpoint).</w:t>
+            </w:r>
+            <w:r>
+              <w:rPr>
+                <w:rFonts w:ascii="Courier New" w:eastAsia="Courier New" w:hAnsi="Courier New" w:cs="Courier New"/>
+                <w:color w:val="3A2A52"/>
+                <w:sz w:val="18"/>
+                <w:szCs w:val="18"/>
+              </w:rPr>
+              <w:br/>
+            </w:r>
+            <w:r>
+              <w:rPr>
+                <w:rFonts w:ascii="Courier New" w:eastAsia="Courier New" w:hAnsi="Courier New" w:cs="Courier New"/>
+                <w:color w:val="FF0000"/>
+                <w:sz w:val="18"/>
+                <w:szCs w:val="18"/>
+              </w:rPr>
+              <w:t>done</w:t>
             </w:r>
           </w:p>
         </w:tc>
@@ -20159,6 +20386,24 @@
                 <w:szCs w:val="18"/>
               </w:rPr>
               <w:t xml:space="preserve"> average pass rate across all sections. When displaying a flagged class result, include the prior year's average for that class/section as context alongside the current figure. Enforce role-based access denying Teacher-role users from querying another teacher's dashboard. Write tests for the outlier threshold logic and the cross-teacher access denial.</w:t>
+            </w:r>
+            <w:r>
+              <w:rPr>
+                <w:rFonts w:ascii="Courier New" w:eastAsia="Courier New" w:hAnsi="Courier New" w:cs="Courier New"/>
+                <w:color w:val="3A2A52"/>
+                <w:sz w:val="18"/>
+                <w:szCs w:val="18"/>
+              </w:rPr>
+              <w:br/>
+            </w:r>
+            <w:r>
+              <w:rPr>
+                <w:rFonts w:ascii="Courier New" w:eastAsia="Courier New" w:hAnsi="Courier New" w:cs="Courier New"/>
+                <w:color w:val="FF0000"/>
+                <w:sz w:val="18"/>
+                <w:szCs w:val="18"/>
+              </w:rPr>
+              <w:t>done</w:t>
             </w:r>
           </w:p>
         </w:tc>

</xml_diff>